<commit_message>
feat(ia): inferir compatibilidades (fitment) de marcas chinas con IA
CassChoice devuelve vehicle_details vacio para marcas chinas (CHERY,
JETOUR, CHANGAN, etc.), dejando las piezas con 0 compatibilidades.

- ia_service.py: servicio agnostico de IA (Gemini / Abacus.AI) que
  infiere marca/modelo/rango de anios a partir del numero de parte.
- sincronizador.py: si una pieza queda con 0 compat, la IA la completa
  automaticamente (flag --sin-ia para desactivar) y enriquece el catalogo.
- models.py: columna 'origen' en Compatibilidad y CatalogoVehiculos.
- services.py: expone 'origen' y 'estimado_ia' en las compatibilidades.
- routers/ia.py: nuevo endpoint POST /ia/completar_fitment.
- index.html: badge 'IA' y nota para compat estimadas + CSS.
- INSTRUCCIONES_RAPIDAS: documentada la solucion y GEMINI_API_KEY.

Probado en vivo: CHERY F4J16-3705110AB paso de 0 a 5-8 compatibilidades.
</commit_message>
<xml_diff>
--- a/INSTRUCCIONES_RAPIDAS.docx
+++ b/INSTRUCCIONES_RAPIDAS.docx
@@ -2,7 +2,7 @@
 <file path=word/document.xml><?xml version="1.0" encoding="utf-8"?>
 <w:document xmlns:w="http://schemas.openxmlformats.org/wordprocessingml/2006/main" xmlns:m="http://schemas.openxmlformats.org/officeDocument/2006/math" xmlns:r="http://schemas.openxmlformats.org/officeDocument/2006/relationships" xmlns:o="urn:schemas-microsoft-com:office:office" xmlns:v="urn:schemas-microsoft-com:vml" xmlns:w10="urn:schemas-microsoft-com:office:word" xmlns:a="http://schemas.openxmlformats.org/drawingml/2006/main" xmlns:pic="http://schemas.openxmlformats.org/drawingml/2006/picture" xmlns:wp="http://schemas.openxmlformats.org/drawingml/2006/wordprocessingDrawing">
   <w:body>
-    <w:bookmarkStart w:id="38" w:name="Xab08209cf2ea71e45a444bc92dbea2172ae61ac"/>
+    <w:bookmarkStart w:id="41" w:name="Xab08209cf2ea71e45a444bc92dbea2172ae61ac"/>
     <w:p>
       <w:pPr>
         <w:pStyle w:val="Heading1"/>
@@ -2221,13 +2221,171 @@
       </w:r>
     </w:p>
     <w:bookmarkEnd w:id="36"/>
-    <w:bookmarkStart w:id="37" w:name="notas-importantes"/>
+    <w:bookmarkStart w:id="39" w:name="marcas-chinas-compatibilidades-con-ia"/>
     <w:p>
       <w:pPr>
         <w:pStyle w:val="Heading2"/>
       </w:pPr>
       <w:r>
-        <w:t xml:space="preserve">📝 Notas Importantes</w:t>
+        <w:t xml:space="preserve">🤖 Marcas chinas: compatibilidades con IA</w:t>
+      </w:r>
+    </w:p>
+    <w:p>
+      <w:pPr>
+        <w:pStyle w:val="FirstParagraph"/>
+      </w:pPr>
+      <w:r>
+        <w:rPr>
+          <w:bCs/>
+          <w:b/>
+        </w:rPr>
+        <w:t xml:space="preserve">El problema:</w:t>
+      </w:r>
+      <w:r>
+        <w:t xml:space="preserve"> </w:t>
+      </w:r>
+      <w:r>
+        <w:t xml:space="preserve">CassChoice</w:t>
+      </w:r>
+      <w:r>
+        <w:t xml:space="preserve"> </w:t>
+      </w:r>
+      <w:r>
+        <w:rPr>
+          <w:bCs/>
+          <w:b/>
+        </w:rPr>
+        <w:t xml:space="preserve">no entrega modelos ni años</w:t>
+      </w:r>
+      <w:r>
+        <w:t xml:space="preserve"> </w:t>
+      </w:r>
+      <w:r>
+        <w:t xml:space="preserve">(</w:t>
+      </w:r>
+      <w:r>
+        <w:rPr>
+          <w:rStyle w:val="VerbatimChar"/>
+        </w:rPr>
+        <w:t xml:space="preserve">vehicle_details</w:t>
+      </w:r>
+      <w:r>
+        <w:t xml:space="preserve"> </w:t>
+      </w:r>
+      <w:r>
+        <w:t xml:space="preserve">viene vacío) para la mayoría de las marcas chinas (CHERY, JETOUR, CHANGAN, GEELY, HAVAL, MG, BYD…). Por eso, al sincronizar una pieza china como</w:t>
+      </w:r>
+      <w:r>
+        <w:t xml:space="preserve"> </w:t>
+      </w:r>
+      <w:r>
+        <w:rPr>
+          <w:rStyle w:val="VerbatimChar"/>
+        </w:rPr>
+        <w:t xml:space="preserve">F4J16-3705110AB</w:t>
+      </w:r>
+      <w:r>
+        <w:t xml:space="preserve">, salían</w:t>
+      </w:r>
+      <w:r>
+        <w:t xml:space="preserve"> </w:t>
+      </w:r>
+      <w:r>
+        <w:rPr>
+          <w:bCs/>
+          <w:b/>
+        </w:rPr>
+        <w:t xml:space="preserve">0 compatibilidades</w:t>
+      </w:r>
+      <w:r>
+        <w:t xml:space="preserve">. No es un error del código: es una limitación del proveedor.</w:t>
+      </w:r>
+    </w:p>
+    <w:p>
+      <w:pPr>
+        <w:pStyle w:val="BodyText"/>
+      </w:pPr>
+      <w:r>
+        <w:rPr>
+          <w:bCs/>
+          <w:b/>
+        </w:rPr>
+        <w:t xml:space="preserve">La solución:</w:t>
+      </w:r>
+      <w:r>
+        <w:t xml:space="preserve"> </w:t>
+      </w:r>
+      <w:r>
+        <w:t xml:space="preserve">el sistema usa</w:t>
+      </w:r>
+      <w:r>
+        <w:t xml:space="preserve"> </w:t>
+      </w:r>
+      <w:r>
+        <w:rPr>
+          <w:bCs/>
+          <w:b/>
+        </w:rPr>
+        <w:t xml:space="preserve">IA</w:t>
+      </w:r>
+      <w:r>
+        <w:t xml:space="preserve"> </w:t>
+      </w:r>
+      <w:r>
+        <w:t xml:space="preserve">para inferir el fitment (modelo + rango de años) a partir del número de parte, la marca y la descripción. Las compatibilidades inferidas se guardan con</w:t>
+      </w:r>
+      <w:r>
+        <w:t xml:space="preserve"> </w:t>
+      </w:r>
+      <w:r>
+        <w:rPr>
+          <w:rStyle w:val="VerbatimChar"/>
+        </w:rPr>
+        <w:t xml:space="preserve">origen="ia"</w:t>
+      </w:r>
+      <w:r>
+        <w:t xml:space="preserve"> </w:t>
+      </w:r>
+      <w:r>
+        <w:t xml:space="preserve">y se muestran en el catálogo con una etiqueta</w:t>
+      </w:r>
+      <w:r>
+        <w:t xml:space="preserve"> </w:t>
+      </w:r>
+      <w:r>
+        <w:rPr>
+          <w:rStyle w:val="VerbatimChar"/>
+          <w:bCs/>
+          <w:b/>
+        </w:rPr>
+        <w:t xml:space="preserve">IA</w:t>
+      </w:r>
+      <w:r>
+        <w:t xml:space="preserve"> </w:t>
+      </w:r>
+      <w:r>
+        <w:t xml:space="preserve">(badge verde) y la nota *</w:t>
+      </w:r>
+      <w:r>
+        <w:t xml:space="preserve">“</w:t>
+      </w:r>
+      <w:r>
+        <w:t xml:space="preserve">· estimadas por IA</w:t>
+      </w:r>
+      <w:r>
+        <w:t xml:space="preserve">”</w:t>
+      </w:r>
+      <w:r>
+        <w:t xml:space="preserve">** para que se distingan de las oficiales.</w:t>
+      </w:r>
+    </w:p>
+    <w:bookmarkStart w:id="37" w:name="cómo-activarla-en-tu-máquina-local"/>
+    <w:p>
+      <w:pPr>
+        <w:pStyle w:val="Heading3"/>
+      </w:pPr>
+      <w:r>
+        <w:t xml:space="preserve">Cómo activarla en tu máquina local</w:t>
       </w:r>
     </w:p>
     <w:p>
@@ -2238,44 +2396,7 @@
         </w:numPr>
       </w:pPr>
       <w:r>
-        <w:rPr>
-          <w:bCs/>
-          <w:b/>
-        </w:rPr>
-        <w:t xml:space="preserve">Localhost del Agente</w:t>
-      </w:r>
-      <w:r>
-        <w:t xml:space="preserve">: Este código corre en la VM del agente Abacus AI. Para ejecutarlo en tu máquina local, descarga los archivos usando el botón</w:t>
-      </w:r>
-      <w:r>
-        <w:t xml:space="preserve"> </w:t>
-      </w:r>
-      <w:r>
-        <w:rPr>
-          <w:bCs/>
-          <w:b/>
-        </w:rPr>
-        <w:t xml:space="preserve">“</w:t>
-      </w:r>
-      <w:r>
-        <w:rPr>
-          <w:bCs/>
-          <w:b/>
-        </w:rPr>
-        <w:t xml:space="preserve">Files</w:t>
-      </w:r>
-      <w:r>
-        <w:rPr>
-          <w:bCs/>
-          <w:b/>
-        </w:rPr>
-        <w:t xml:space="preserve">”</w:t>
-      </w:r>
-      <w:r>
-        <w:t xml:space="preserve"> </w:t>
-      </w:r>
-      <w:r>
-        <w:t xml:space="preserve">en la esquina superior derecha.</w:t>
+        <w:t xml:space="preserve">Consigue una API key gratuita de Google Gemini en https://aistudio.google.com/app/apikey</w:t>
       </w:r>
     </w:p>
     <w:p>
@@ -2286,14 +2407,7 @@
         </w:numPr>
       </w:pPr>
       <w:r>
-        <w:rPr>
-          <w:bCs/>
-          <w:b/>
-        </w:rPr>
-        <w:t xml:space="preserve">Margen del 6%</w:t>
-      </w:r>
-      <w:r>
-        <w:t xml:space="preserve">: Se aplica automáticamente sobre el precio FOB. Si el precio FOB es</w:t>
+        <w:t xml:space="preserve">Agrégala a tu archivo</w:t>
       </w:r>
       <w:r>
         <w:t xml:space="preserve"> </w:t>
@@ -2302,22 +2416,25 @@
         <w:rPr>
           <w:rStyle w:val="VerbatimChar"/>
         </w:rPr>
-        <w:t xml:space="preserve">16.5586 USD</w:t>
-      </w:r>
-      <w:r>
-        <w:t xml:space="preserve">, el precio de venta será</w:t>
-      </w:r>
-      <w:r>
-        <w:t xml:space="preserve"> </w:t>
-      </w:r>
+        <w:t xml:space="preserve">.env</w:t>
+      </w:r>
+      <w:r>
+        <w:t xml:space="preserve">:</w:t>
+      </w:r>
+    </w:p>
+    <w:p>
+      <w:pPr>
+        <w:numPr>
+          <w:ilvl w:val="0"/>
+          <w:numId w:val="1000"/>
+        </w:numPr>
+        <w:pStyle w:val="SourceCode"/>
+      </w:pPr>
       <w:r>
         <w:rPr>
           <w:rStyle w:val="VerbatimChar"/>
         </w:rPr>
-        <w:t xml:space="preserve">17.5521 USD</w:t>
-      </w:r>
-      <w:r>
-        <w:t xml:space="preserve">.</w:t>
+        <w:t xml:space="preserve">GEMINI_API_KEY=tu_api_key_aqui</w:t>
       </w:r>
     </w:p>
     <w:p>
@@ -2328,75 +2445,160 @@
         </w:numPr>
       </w:pPr>
       <w:r>
+        <w:t xml:space="preserve">¡Listo! A partir de ahí, cada vez que sincronices una pieza china sin fitment, la IA lo completa automáticamente.</w:t>
+      </w:r>
+    </w:p>
+    <w:bookmarkEnd w:id="37"/>
+    <w:bookmarkStart w:id="38" w:name="uso"/>
+    <w:p>
+      <w:pPr>
+        <w:pStyle w:val="Heading3"/>
+      </w:pPr>
+      <w:r>
+        <w:t xml:space="preserve">Uso</w:t>
+      </w:r>
+    </w:p>
+    <w:p>
+      <w:pPr>
+        <w:numPr>
+          <w:ilvl w:val="0"/>
+          <w:numId w:val="1003"/>
+        </w:numPr>
+      </w:pPr>
+      <w:r>
         <w:rPr>
           <w:bCs/>
           <w:b/>
         </w:rPr>
-        <w:t xml:space="preserve">Seguridad</w:t>
-      </w:r>
-      <w:r>
-        <w:t xml:space="preserve">: El archivo</w:t>
-      </w:r>
-      <w:r>
-        <w:t xml:space="preserve"> </w:t>
-      </w:r>
-      <w:r>
-        <w:rPr>
-          <w:rStyle w:val="VerbatimChar"/>
-        </w:rPr>
-        <w:t xml:space="preserve">.env</w:t>
-      </w:r>
-      <w:r>
-        <w:t xml:space="preserve"> </w:t>
-      </w:r>
-      <w:r>
-        <w:t xml:space="preserve">con tus credenciales está en</w:t>
-      </w:r>
-      <w:r>
-        <w:t xml:space="preserve"> </w:t>
-      </w:r>
-      <w:r>
-        <w:rPr>
-          <w:rStyle w:val="VerbatimChar"/>
-        </w:rPr>
-        <w:t xml:space="preserve">.gitignore</w:t>
-      </w:r>
-      <w:r>
-        <w:t xml:space="preserve"> </w:t>
-      </w:r>
-      <w:r>
-        <w:t xml:space="preserve">y</w:t>
-      </w:r>
-      <w:r>
-        <w:t xml:space="preserve"> </w:t>
-      </w:r>
+        <w:t xml:space="preserve">Automático al sincronizar</w:t>
+      </w:r>
+      <w:r>
+        <w:t xml:space="preserve">: si una pieza queda con 0 compatibilidades, la IA las infiere sola.</w:t>
+      </w:r>
+    </w:p>
+    <w:p>
+      <w:pPr>
+        <w:numPr>
+          <w:ilvl w:val="0"/>
+          <w:numId w:val="1000"/>
+        </w:numPr>
+        <w:pStyle w:val="SourceCode"/>
+      </w:pPr>
+      <w:r>
+        <w:rPr>
+          <w:rStyle w:val="ExtensionTok"/>
+        </w:rPr>
+        <w:t xml:space="preserve">python</w:t>
+      </w:r>
+      <w:r>
+        <w:rPr>
+          <w:rStyle w:val="NormalTok"/>
+        </w:rPr>
+        <w:t xml:space="preserve"> sincronizador.py </w:t>
+      </w:r>
+      <w:r>
+        <w:rPr>
+          <w:rStyle w:val="AttributeTok"/>
+        </w:rPr>
+        <w:t xml:space="preserve">--piezas</w:t>
+      </w:r>
+      <w:r>
+        <w:rPr>
+          <w:rStyle w:val="NormalTok"/>
+        </w:rPr>
+        <w:t xml:space="preserve"> F4J16-3705110AB</w:t>
+      </w:r>
+      <w:r>
+        <w:br/>
+      </w:r>
+      <w:r>
+        <w:rPr>
+          <w:rStyle w:val="CommentTok"/>
+        </w:rPr>
+        <w:t xml:space="preserve"># (usa --sin-ia para desactivar la inferencia por IA)</w:t>
+      </w:r>
+    </w:p>
+    <w:p>
+      <w:pPr>
+        <w:numPr>
+          <w:ilvl w:val="0"/>
+          <w:numId w:val="1003"/>
+        </w:numPr>
+      </w:pPr>
       <w:r>
         <w:rPr>
           <w:bCs/>
           <w:b/>
         </w:rPr>
-        <w:t xml:space="preserve">no se subió a GitHub</w:t>
-      </w:r>
-      <w:r>
-        <w:t xml:space="preserve">.</w:t>
+        <w:t xml:space="preserve">Completar piezas ya cargadas</w:t>
+      </w:r>
+      <w:r>
+        <w:t xml:space="preserve"> </w:t>
+      </w:r>
+      <w:r>
+        <w:t xml:space="preserve">(endpoint autenticado):</w:t>
       </w:r>
     </w:p>
     <w:p>
       <w:pPr>
         <w:numPr>
           <w:ilvl w:val="0"/>
-          <w:numId w:val="1002"/>
+          <w:numId w:val="1000"/>
         </w:numPr>
+        <w:pStyle w:val="SourceCode"/>
+      </w:pPr>
+      <w:r>
+        <w:rPr>
+          <w:rStyle w:val="VerbatimChar"/>
+        </w:rPr>
+        <w:t xml:space="preserve">POST /ia/completar_fitment          -&gt; procesa las piezas SIN compatibilidades</w:t>
+      </w:r>
+      <w:r>
+        <w:br/>
+      </w:r>
+      <w:r>
+        <w:rPr>
+          <w:rStyle w:val="VerbatimChar"/>
+        </w:rPr>
+        <w:t xml:space="preserve">POST /ia/completar_fitment {"autoparte_id": 1}   -&gt; una pieza concreta</w:t>
+      </w:r>
+    </w:p>
+    <w:p>
+      <w:pPr>
+        <w:pStyle w:val="BlockText"/>
+      </w:pPr>
+      <w:r>
+        <w:t xml:space="preserve">Si no configuras</w:t>
+      </w:r>
+      <w:r>
+        <w:t xml:space="preserve"> </w:t>
+      </w:r>
+      <w:r>
+        <w:rPr>
+          <w:rStyle w:val="VerbatimChar"/>
+        </w:rPr>
+        <w:t xml:space="preserve">GEMINI_API_KEY</w:t>
+      </w:r>
+      <w:r>
+        <w:t xml:space="preserve">, el sistema sigue funcionando normalmente; simplemente no rellena las compatibilidades de las marcas chinas (las deja vacías en lugar de fallar).</w:t>
+      </w:r>
+    </w:p>
+    <w:p>
+      <w:pPr>
+        <w:pStyle w:val="FirstParagraph"/>
       </w:pPr>
       <w:r>
         <w:rPr>
           <w:bCs/>
           <w:b/>
         </w:rPr>
-        <w:t xml:space="preserve">PR Mergeado</w:t>
-      </w:r>
-      <w:r>
-        <w:t xml:space="preserve">: El Pull Request #2 fue mergeado exitosamente a</w:t>
+        <w:t xml:space="preserve">Prueba real:</w:t>
+      </w:r>
+      <w:r>
+        <w:t xml:space="preserve"> </w:t>
+      </w:r>
+      <w:r>
+        <w:t xml:space="preserve">la pieza CHERY</w:t>
       </w:r>
       <w:r>
         <w:t xml:space="preserve"> </w:t>
@@ -2405,13 +2607,29 @@
         <w:rPr>
           <w:rStyle w:val="VerbatimChar"/>
         </w:rPr>
-        <w:t xml:space="preserve">main</w:t>
-      </w:r>
-      <w:r>
-        <w:t xml:space="preserve"> </w:t>
-      </w:r>
-      <w:r>
-        <w:t xml:space="preserve">y todos los cambios ya están en el repositorio.</w:t>
+        <w:t xml:space="preserve">F4J16-3705110AB</w:t>
+      </w:r>
+      <w:r>
+        <w:t xml:space="preserve"> </w:t>
+      </w:r>
+      <w:r>
+        <w:t xml:space="preserve">pasó de</w:t>
+      </w:r>
+      <w:r>
+        <w:t xml:space="preserve"> </w:t>
+      </w:r>
+      <w:r>
+        <w:rPr>
+          <w:bCs/>
+          <w:b/>
+        </w:rPr>
+        <w:t xml:space="preserve">0 → 5-8 compatibilidades</w:t>
+      </w:r>
+      <w:r>
+        <w:t xml:space="preserve"> </w:t>
+      </w:r>
+      <w:r>
+        <w:t xml:space="preserve">(Arrizo 5/6, Tiggo 4/7/8, y modelos JETOUR que comparten plataforma).</w:t>
       </w:r>
     </w:p>
     <w:p>
@@ -2421,23 +2639,225 @@
         </w:pict>
       </w:r>
     </w:p>
-    <w:p>
-      <w:pPr>
-        <w:pStyle w:val="FirstParagraph"/>
+    <w:bookmarkEnd w:id="38"/>
+    <w:bookmarkEnd w:id="39"/>
+    <w:bookmarkStart w:id="40" w:name="notas-importantes"/>
+    <w:p>
+      <w:pPr>
+        <w:pStyle w:val="Heading2"/>
+      </w:pPr>
+      <w:r>
+        <w:t xml:space="preserve">📝 Notas Importantes</w:t>
+      </w:r>
+    </w:p>
+    <w:p>
+      <w:pPr>
+        <w:numPr>
+          <w:ilvl w:val="0"/>
+          <w:numId w:val="1004"/>
+        </w:numPr>
       </w:pPr>
       <w:r>
         <w:rPr>
           <w:bCs/>
           <w:b/>
         </w:rPr>
+        <w:t xml:space="preserve">Localhost del Agente</w:t>
+      </w:r>
+      <w:r>
+        <w:t xml:space="preserve">: Este código corre en la VM del agente Abacus AI. Para ejecutarlo en tu máquina local, descarga los archivos usando el botón</w:t>
+      </w:r>
+      <w:r>
+        <w:t xml:space="preserve"> </w:t>
+      </w:r>
+      <w:r>
+        <w:rPr>
+          <w:bCs/>
+          <w:b/>
+        </w:rPr>
+        <w:t xml:space="preserve">“</w:t>
+      </w:r>
+      <w:r>
+        <w:rPr>
+          <w:bCs/>
+          <w:b/>
+        </w:rPr>
+        <w:t xml:space="preserve">Files</w:t>
+      </w:r>
+      <w:r>
+        <w:rPr>
+          <w:bCs/>
+          <w:b/>
+        </w:rPr>
+        <w:t xml:space="preserve">”</w:t>
+      </w:r>
+      <w:r>
+        <w:t xml:space="preserve"> </w:t>
+      </w:r>
+      <w:r>
+        <w:t xml:space="preserve">en la esquina superior derecha.</w:t>
+      </w:r>
+    </w:p>
+    <w:p>
+      <w:pPr>
+        <w:numPr>
+          <w:ilvl w:val="0"/>
+          <w:numId w:val="1004"/>
+        </w:numPr>
+      </w:pPr>
+      <w:r>
+        <w:rPr>
+          <w:bCs/>
+          <w:b/>
+        </w:rPr>
+        <w:t xml:space="preserve">Margen del 6%</w:t>
+      </w:r>
+      <w:r>
+        <w:t xml:space="preserve">: Se aplica automáticamente sobre el precio FOB. Si el precio FOB es</w:t>
+      </w:r>
+      <w:r>
+        <w:t xml:space="preserve"> </w:t>
+      </w:r>
+      <w:r>
+        <w:rPr>
+          <w:rStyle w:val="VerbatimChar"/>
+        </w:rPr>
+        <w:t xml:space="preserve">16.5586 USD</w:t>
+      </w:r>
+      <w:r>
+        <w:t xml:space="preserve">, el precio de venta será</w:t>
+      </w:r>
+      <w:r>
+        <w:t xml:space="preserve"> </w:t>
+      </w:r>
+      <w:r>
+        <w:rPr>
+          <w:rStyle w:val="VerbatimChar"/>
+        </w:rPr>
+        <w:t xml:space="preserve">17.5521 USD</w:t>
+      </w:r>
+      <w:r>
+        <w:t xml:space="preserve">.</w:t>
+      </w:r>
+    </w:p>
+    <w:p>
+      <w:pPr>
+        <w:numPr>
+          <w:ilvl w:val="0"/>
+          <w:numId w:val="1004"/>
+        </w:numPr>
+      </w:pPr>
+      <w:r>
+        <w:rPr>
+          <w:bCs/>
+          <w:b/>
+        </w:rPr>
+        <w:t xml:space="preserve">Seguridad</w:t>
+      </w:r>
+      <w:r>
+        <w:t xml:space="preserve">: El archivo</w:t>
+      </w:r>
+      <w:r>
+        <w:t xml:space="preserve"> </w:t>
+      </w:r>
+      <w:r>
+        <w:rPr>
+          <w:rStyle w:val="VerbatimChar"/>
+        </w:rPr>
+        <w:t xml:space="preserve">.env</w:t>
+      </w:r>
+      <w:r>
+        <w:t xml:space="preserve"> </w:t>
+      </w:r>
+      <w:r>
+        <w:t xml:space="preserve">con tus credenciales está en</w:t>
+      </w:r>
+      <w:r>
+        <w:t xml:space="preserve"> </w:t>
+      </w:r>
+      <w:r>
+        <w:rPr>
+          <w:rStyle w:val="VerbatimChar"/>
+        </w:rPr>
+        <w:t xml:space="preserve">.gitignore</w:t>
+      </w:r>
+      <w:r>
+        <w:t xml:space="preserve"> </w:t>
+      </w:r>
+      <w:r>
+        <w:t xml:space="preserve">y</w:t>
+      </w:r>
+      <w:r>
+        <w:t xml:space="preserve"> </w:t>
+      </w:r>
+      <w:r>
+        <w:rPr>
+          <w:bCs/>
+          <w:b/>
+        </w:rPr>
+        <w:t xml:space="preserve">no se subió a GitHub</w:t>
+      </w:r>
+      <w:r>
+        <w:t xml:space="preserve">.</w:t>
+      </w:r>
+    </w:p>
+    <w:p>
+      <w:pPr>
+        <w:numPr>
+          <w:ilvl w:val="0"/>
+          <w:numId w:val="1004"/>
+        </w:numPr>
+      </w:pPr>
+      <w:r>
+        <w:rPr>
+          <w:bCs/>
+          <w:b/>
+        </w:rPr>
+        <w:t xml:space="preserve">PR Mergeado</w:t>
+      </w:r>
+      <w:r>
+        <w:t xml:space="preserve">: El Pull Request #2 fue mergeado exitosamente a</w:t>
+      </w:r>
+      <w:r>
+        <w:t xml:space="preserve"> </w:t>
+      </w:r>
+      <w:r>
+        <w:rPr>
+          <w:rStyle w:val="VerbatimChar"/>
+        </w:rPr>
+        <w:t xml:space="preserve">main</w:t>
+      </w:r>
+      <w:r>
+        <w:t xml:space="preserve"> </w:t>
+      </w:r>
+      <w:r>
+        <w:t xml:space="preserve">y todos los cambios ya están en el repositorio.</w:t>
+      </w:r>
+    </w:p>
+    <w:p>
+      <w:r>
+        <w:pict>
+          <v:rect style="width:0;height:1.5pt" o:hralign="center" o:hrstd="t" o:hr="t"/>
+        </w:pict>
+      </w:r>
+    </w:p>
+    <w:p>
+      <w:pPr>
+        <w:pStyle w:val="FirstParagraph"/>
+      </w:pPr>
+      <w:r>
+        <w:rPr>
+          <w:bCs/>
+          <w:b/>
+        </w:rPr>
         <w:t xml:space="preserve">Repositorio actualizado</w:t>
       </w:r>
       <w:r>
         <w:t xml:space="preserve">: https://github.com/fjcht/partsbot</w:t>
       </w:r>
     </w:p>
-    <w:bookmarkEnd w:id="37"/>
-    <w:bookmarkEnd w:id="38"/>
+    <w:bookmarkEnd w:id="40"/>
+    <w:bookmarkEnd w:id="41"/>
     <w:sectPr/>
   </w:body>
 </w:document>
@@ -2712,6 +3132,39 @@
     <w:abstractNumId w:val="991"/>
   </w:num>
   <w:num w:numId="1002">
+    <w:abstractNumId w:val="99411"/>
+    <w:lvlOverride w:ilvl="0">
+      <w:startOverride w:val="1"/>
+    </w:lvlOverride>
+    <w:lvlOverride w:ilvl="1">
+      <w:startOverride w:val="1"/>
+    </w:lvlOverride>
+    <w:lvlOverride w:ilvl="2">
+      <w:startOverride w:val="1"/>
+    </w:lvlOverride>
+    <w:lvlOverride w:ilvl="3">
+      <w:startOverride w:val="1"/>
+    </w:lvlOverride>
+    <w:lvlOverride w:ilvl="4">
+      <w:startOverride w:val="1"/>
+    </w:lvlOverride>
+    <w:lvlOverride w:ilvl="5">
+      <w:startOverride w:val="1"/>
+    </w:lvlOverride>
+    <w:lvlOverride w:ilvl="6">
+      <w:startOverride w:val="1"/>
+    </w:lvlOverride>
+    <w:lvlOverride w:ilvl="7">
+      <w:startOverride w:val="1"/>
+    </w:lvlOverride>
+    <w:lvlOverride w:ilvl="8">
+      <w:startOverride w:val="1"/>
+    </w:lvlOverride>
+  </w:num>
+  <w:num w:numId="1003">
+    <w:abstractNumId w:val="991"/>
+  </w:num>
+  <w:num w:numId="1004">
     <w:abstractNumId w:val="99411"/>
     <w:lvlOverride w:ilvl="0">
       <w:startOverride w:val="1"/>

</xml_diff>

<commit_message>
feat(ia): poblar catalogo de marcas chinas con IA + script setup todo-en-uno
- ia_service.inferir_modelos_marca(): infiere modelos+anios de una marca completa.
- sincronizador: nueva funcion completar_marcas_faltantes() y flag CLI
  --completar-marcas que puebla el catalogo de vehiculos de TODAS las marcas
  chinas (necesita_completar=True) con IA, igual que las occidentales. Limpia
  las filas placeholder (marca sin modelo).
- setup.bat / setup.sh: script todo-en-uno (venv, deps, .env, init_db,
  importar merchant, completar marcas con IA, sincronizar piezas, arrancar).
- iniciar_servidor.bat: arranque rapido del servidor web.
- INSTRUCCIONES_RAPIDAS: documentado el setup en 1 paso y comandos IA.

Probado en vivo: JETOUR 0 -> 50 filas, GEELY -> 190 filas (modelos+anios [ia]).
</commit_message>
<xml_diff>
--- a/INSTRUCCIONES_RAPIDAS.docx
+++ b/INSTRUCCIONES_RAPIDAS.docx
@@ -2,7 +2,7 @@
 <file path=word/document.xml><?xml version="1.0" encoding="utf-8"?>
 <w:document xmlns:w="http://schemas.openxmlformats.org/wordprocessingml/2006/main" xmlns:m="http://schemas.openxmlformats.org/officeDocument/2006/math" xmlns:r="http://schemas.openxmlformats.org/officeDocument/2006/relationships" xmlns:o="urn:schemas-microsoft-com:office:office" xmlns:v="urn:schemas-microsoft-com:vml" xmlns:w10="urn:schemas-microsoft-com:office:word" xmlns:a="http://schemas.openxmlformats.org/drawingml/2006/main" xmlns:pic="http://schemas.openxmlformats.org/drawingml/2006/picture" xmlns:wp="http://schemas.openxmlformats.org/drawingml/2006/wordprocessingDrawing">
   <w:body>
-    <w:bookmarkStart w:id="41" w:name="Xab08209cf2ea71e45a444bc92dbea2172ae61ac"/>
+    <w:bookmarkStart w:id="43" w:name="Xab08209cf2ea71e45a444bc92dbea2172ae61ac"/>
     <w:p>
       <w:pPr>
         <w:pStyle w:val="Heading1"/>
@@ -11,16 +11,287 @@
         <w:t xml:space="preserve">🚀 Instrucciones Rápidas — FCH AutoLab PartsBot</w:t>
       </w:r>
     </w:p>
-    <w:bookmarkStart w:id="27" w:name="Xcf6a212d55bd6da09cfa75b1da2965cff304cfc"/>
+    <w:bookmarkStart w:id="21" w:name="instalación-en-1-solo-paso-recomendado"/>
     <w:p>
       <w:pPr>
         <w:pStyle w:val="Heading2"/>
       </w:pPr>
       <w:r>
+        <w:t xml:space="preserve">⚡ Instalación en 1 solo paso (recomendado)</w:t>
+      </w:r>
+    </w:p>
+    <w:p>
+      <w:pPr>
+        <w:pStyle w:val="FirstParagraph"/>
+      </w:pPr>
+      <w:r>
+        <w:t xml:space="preserve">Ya no tienes que ejecutar todo a mano. Hay un script que hace</w:t>
+      </w:r>
+      <w:r>
+        <w:t xml:space="preserve"> </w:t>
+      </w:r>
+      <w:r>
+        <w:rPr>
+          <w:bCs/>
+          <w:b/>
+        </w:rPr>
+        <w:t xml:space="preserve">TODO</w:t>
+      </w:r>
+      <w:r>
+        <w:t xml:space="preserve"> </w:t>
+      </w:r>
+      <w:r>
+        <w:t xml:space="preserve">(entorno virtual, dependencias, base de datos, catálogo, marcas chinas con IA</w:t>
+      </w:r>
+      <w:r>
+        <w:t xml:space="preserve"> </w:t>
+      </w:r>
+      <w:r>
+        <w:t xml:space="preserve">y piezas):</w:t>
+      </w:r>
+    </w:p>
+    <w:p>
+      <w:pPr>
+        <w:pStyle w:val="BodyText"/>
+      </w:pPr>
+      <w:r>
+        <w:rPr>
+          <w:bCs/>
+          <w:b/>
+        </w:rPr>
+        <w:t xml:space="preserve">Windows:</w:t>
+      </w:r>
+    </w:p>
+    <w:p>
+      <w:pPr>
+        <w:pStyle w:val="SourceCode"/>
+      </w:pPr>
+      <w:r>
+        <w:rPr>
+          <w:rStyle w:val="VerbatimChar"/>
+        </w:rPr>
+        <w:t xml:space="preserve">setup.bat</w:t>
+      </w:r>
+    </w:p>
+    <w:p>
+      <w:pPr>
+        <w:pStyle w:val="FirstParagraph"/>
+      </w:pPr>
+      <w:r>
+        <w:rPr>
+          <w:bCs/>
+          <w:b/>
+        </w:rPr>
+        <w:t xml:space="preserve">Linux / macOS:</w:t>
+      </w:r>
+    </w:p>
+    <w:p>
+      <w:pPr>
+        <w:pStyle w:val="SourceCode"/>
+      </w:pPr>
+      <w:r>
+        <w:rPr>
+          <w:rStyle w:val="FunctionTok"/>
+        </w:rPr>
+        <w:t xml:space="preserve">bash</w:t>
+      </w:r>
+      <w:r>
+        <w:rPr>
+          <w:rStyle w:val="NormalTok"/>
+        </w:rPr>
+        <w:t xml:space="preserve"> setup.sh</w:t>
+      </w:r>
+    </w:p>
+    <w:p>
+      <w:pPr>
+        <w:pStyle w:val="FirstParagraph"/>
+      </w:pPr>
+      <w:r>
+        <w:t xml:space="preserve">El script te pedirá completar el</w:t>
+      </w:r>
+      <w:r>
+        <w:t xml:space="preserve"> </w:t>
+      </w:r>
+      <w:r>
+        <w:rPr>
+          <w:rStyle w:val="VerbatimChar"/>
+        </w:rPr>
+        <w:t xml:space="preserve">.env</w:t>
+      </w:r>
+      <w:r>
+        <w:t xml:space="preserve"> </w:t>
+      </w:r>
+      <w:r>
+        <w:t xml:space="preserve">(credenciales CassChoice +</w:t>
+      </w:r>
+      <w:r>
+        <w:t xml:space="preserve"> </w:t>
+      </w:r>
+      <w:r>
+        <w:rPr>
+          <w:rStyle w:val="VerbatimChar"/>
+        </w:rPr>
+        <w:t xml:space="preserve">GEMINI_API_KEY</w:t>
+      </w:r>
+      <w:r>
+        <w:t xml:space="preserve">)</w:t>
+      </w:r>
+      <w:r>
+        <w:t xml:space="preserve"> </w:t>
+      </w:r>
+      <w:r>
+        <w:t xml:space="preserve">y luego hace el resto solo. Al terminar puedes arrancar el servidor con</w:t>
+      </w:r>
+      <w:r>
+        <w:t xml:space="preserve"> </w:t>
+      </w:r>
+      <w:r>
+        <w:rPr>
+          <w:rStyle w:val="VerbatimChar"/>
+        </w:rPr>
+        <w:t xml:space="preserve">iniciar_servidor.bat</w:t>
+      </w:r>
+      <w:r>
+        <w:t xml:space="preserve"> </w:t>
+      </w:r>
+      <w:r>
+        <w:t xml:space="preserve">(Windows) o</w:t>
+      </w:r>
+      <w:r>
+        <w:t xml:space="preserve"> </w:t>
+      </w:r>
+      <w:r>
+        <w:rPr>
+          <w:rStyle w:val="VerbatimChar"/>
+        </w:rPr>
+        <w:t xml:space="preserve">python -m uvicorn main:app --reload</w:t>
+      </w:r>
+      <w:r>
+        <w:t xml:space="preserve">.</w:t>
+      </w:r>
+    </w:p>
+    <w:p>
+      <w:pPr>
+        <w:pStyle w:val="BlockText"/>
+      </w:pPr>
+      <w:r>
+        <w:t xml:space="preserve">🔑 Necesitas una</w:t>
+      </w:r>
+      <w:r>
+        <w:t xml:space="preserve"> </w:t>
+      </w:r>
+      <w:r>
+        <w:rPr>
+          <w:rStyle w:val="VerbatimChar"/>
+        </w:rPr>
+        <w:t xml:space="preserve">GEMINI_API_KEY</w:t>
+      </w:r>
+      <w:r>
+        <w:t xml:space="preserve"> </w:t>
+      </w:r>
+      <w:r>
+        <w:t xml:space="preserve">gratuita (https://aistudio.google.com/app/apikey)</w:t>
+      </w:r>
+      <w:r>
+        <w:t xml:space="preserve"> </w:t>
+      </w:r>
+      <w:r>
+        <w:t xml:space="preserve">para que se completen las marcas chinas con IA.</w:t>
+      </w:r>
+    </w:p>
+    <w:bookmarkStart w:id="20" w:name="Xaaa272061022ac93a19d60bb85345bde9624fad"/>
+    <w:p>
+      <w:pPr>
+        <w:pStyle w:val="Heading3"/>
+      </w:pPr>
+      <w:r>
+        <w:t xml:space="preserve">Comandos de IA por separado (si prefieres control manual)</w:t>
+      </w:r>
+    </w:p>
+    <w:p>
+      <w:pPr>
+        <w:pStyle w:val="SourceCode"/>
+      </w:pPr>
+      <w:r>
+        <w:rPr>
+          <w:rStyle w:val="CommentTok"/>
+        </w:rPr>
+        <w:t xml:space="preserve"># Poblar TODAS las marcas chinas (modelos + años) en el catálogo de vehículos</w:t>
+      </w:r>
+      <w:r>
+        <w:br/>
+      </w:r>
+      <w:r>
+        <w:rPr>
+          <w:rStyle w:val="ExtensionTok"/>
+        </w:rPr>
+        <w:t xml:space="preserve">python</w:t>
+      </w:r>
+      <w:r>
+        <w:rPr>
+          <w:rStyle w:val="NormalTok"/>
+        </w:rPr>
+        <w:t xml:space="preserve"> sincronizador.py </w:t>
+      </w:r>
+      <w:r>
+        <w:rPr>
+          <w:rStyle w:val="AttributeTok"/>
+        </w:rPr>
+        <w:t xml:space="preserve">--completar-marcas</w:t>
+      </w:r>
+      <w:r>
+        <w:br/>
+      </w:r>
+      <w:r>
+        <w:br/>
+      </w:r>
+      <w:r>
+        <w:rPr>
+          <w:rStyle w:val="CommentTok"/>
+        </w:rPr>
+        <w:t xml:space="preserve"># Completar las compatibilidades (fitment) de piezas ya cargadas sin modelo</w:t>
+      </w:r>
+      <w:r>
+        <w:br/>
+      </w:r>
+      <w:r>
+        <w:rPr>
+          <w:rStyle w:val="ExtensionTok"/>
+        </w:rPr>
+        <w:t xml:space="preserve">python</w:t>
+      </w:r>
+      <w:r>
+        <w:rPr>
+          <w:rStyle w:val="NormalTok"/>
+        </w:rPr>
+        <w:t xml:space="preserve"> sincronizador.py </w:t>
+      </w:r>
+      <w:r>
+        <w:rPr>
+          <w:rStyle w:val="AttributeTok"/>
+        </w:rPr>
+        <w:t xml:space="preserve">--completar-fitment</w:t>
+      </w:r>
+    </w:p>
+    <w:p>
+      <w:r>
+        <w:pict>
+          <v:rect style="width:0;height:1.5pt" o:hralign="center" o:hrstd="t" o:hr="t"/>
+        </w:pict>
+      </w:r>
+    </w:p>
+    <w:bookmarkEnd w:id="20"/>
+    <w:bookmarkEnd w:id="21"/>
+    <w:bookmarkStart w:id="29" w:name="Xcf6a212d55bd6da09cfa75b1da2965cff304cfc"/>
+    <w:p>
+      <w:pPr>
+        <w:pStyle w:val="Heading2"/>
+      </w:pPr>
+      <w:r>
         <w:t xml:space="preserve">✅ Cambios Implementados (Última actualización)</w:t>
       </w:r>
     </w:p>
-    <w:bookmarkStart w:id="20" w:name="paleta-de-marca-fch-autolab"/>
+    <w:bookmarkStart w:id="22" w:name="paleta-de-marca-fch-autolab"/>
     <w:p>
       <w:pPr>
         <w:pStyle w:val="Heading3"/>
@@ -146,8 +417,8 @@
         </w:pict>
       </w:r>
     </w:p>
-    <w:bookmarkEnd w:id="20"/>
-    <w:bookmarkStart w:id="21" w:name="login-automático-a-casschoice"/>
+    <w:bookmarkEnd w:id="22"/>
+    <w:bookmarkStart w:id="23" w:name="login-automático-a-casschoice"/>
     <w:p>
       <w:pPr>
         <w:pStyle w:val="Heading3"/>
@@ -294,8 +565,8 @@
         </w:pict>
       </w:r>
     </w:p>
-    <w:bookmarkEnd w:id="21"/>
-    <w:bookmarkStart w:id="25" w:name="bugs-corregidos-en-el-sincronizador"/>
+    <w:bookmarkEnd w:id="23"/>
+    <w:bookmarkStart w:id="27" w:name="bugs-corregidos-en-el-sincronizador"/>
     <w:p>
       <w:pPr>
         <w:pStyle w:val="Heading3"/>
@@ -304,7 +575,7 @@
         <w:t xml:space="preserve">🐞 3. Bugs Corregidos en el Sincronizador</w:t>
       </w:r>
     </w:p>
-    <w:bookmarkStart w:id="22" w:name="bug-1-vehicle_details-como-texto"/>
+    <w:bookmarkStart w:id="24" w:name="bug-1-vehicle_details-como-texto"/>
     <w:p>
       <w:pPr>
         <w:pStyle w:val="Heading4"/>
@@ -430,8 +701,8 @@
         <w:t xml:space="preserve">2024</w:t>
       </w:r>
     </w:p>
-    <w:bookmarkEnd w:id="22"/>
-    <w:bookmarkStart w:id="23" w:name="X16f24688a052b6eddc4fdb51e8ea5c98fe41c38"/>
+    <w:bookmarkEnd w:id="24"/>
+    <w:bookmarkStart w:id="25" w:name="X16f24688a052b6eddc4fdb51e8ea5c98fe41c38"/>
     <w:p>
       <w:pPr>
         <w:pStyle w:val="Heading4"/>
@@ -538,8 +809,8 @@
         <w:t xml:space="preserve">→ código OE/original</w:t>
       </w:r>
     </w:p>
-    <w:bookmarkEnd w:id="23"/>
-    <w:bookmarkStart w:id="24" w:name="bug-3-descripción-vacía"/>
+    <w:bookmarkEnd w:id="25"/>
+    <w:bookmarkStart w:id="26" w:name="bug-3-descripción-vacía"/>
     <w:p>
       <w:pPr>
         <w:pStyle w:val="Heading4"/>
@@ -575,9 +846,9 @@
         </w:pict>
       </w:r>
     </w:p>
-    <w:bookmarkEnd w:id="24"/>
-    <w:bookmarkEnd w:id="25"/>
-    <w:bookmarkStart w:id="26" w:name="importador-offline-importar_merchant.py"/>
+    <w:bookmarkEnd w:id="26"/>
+    <w:bookmarkEnd w:id="27"/>
+    <w:bookmarkStart w:id="28" w:name="importador-offline-importar_merchant.py"/>
     <w:p>
       <w:pPr>
         <w:pStyle w:val="Heading3"/>
@@ -716,9 +987,9 @@
         </w:pict>
       </w:r>
     </w:p>
-    <w:bookmarkEnd w:id="26"/>
-    <w:bookmarkEnd w:id="27"/>
-    <w:bookmarkStart w:id="32" w:name="prueba-rápida"/>
+    <w:bookmarkEnd w:id="28"/>
+    <w:bookmarkEnd w:id="29"/>
+    <w:bookmarkStart w:id="34" w:name="prueba-rápida"/>
     <w:p>
       <w:pPr>
         <w:pStyle w:val="Heading2"/>
@@ -727,7 +998,7 @@
         <w:t xml:space="preserve">🧪 Prueba Rápida</w:t>
       </w:r>
     </w:p>
-    <w:bookmarkStart w:id="28" w:name="inicializar-la-base-de-datos"/>
+    <w:bookmarkStart w:id="30" w:name="inicializar-la-base-de-datos"/>
     <w:p>
       <w:pPr>
         <w:pStyle w:val="Heading3"/>
@@ -753,8 +1024,8 @@
         <w:t xml:space="preserve"> init_db.py</w:t>
       </w:r>
     </w:p>
-    <w:bookmarkEnd w:id="28"/>
-    <w:bookmarkStart w:id="29" w:name="importar-datos-reales-modo-demo"/>
+    <w:bookmarkEnd w:id="30"/>
+    <w:bookmarkStart w:id="31" w:name="importar-datos-reales-modo-demo"/>
     <w:p>
       <w:pPr>
         <w:pStyle w:val="Heading3"/>
@@ -780,8 +1051,8 @@
         <w:t xml:space="preserve"> importar_merchant.py merchant.txt</w:t>
       </w:r>
     </w:p>
-    <w:bookmarkEnd w:id="29"/>
-    <w:bookmarkStart w:id="30" w:name="levantar-el-servidor"/>
+    <w:bookmarkEnd w:id="31"/>
+    <w:bookmarkStart w:id="32" w:name="levantar-el-servidor"/>
     <w:p>
       <w:pPr>
         <w:pStyle w:val="Heading3"/>
@@ -813,8 +1084,8 @@
         <w:t xml:space="preserve">--reload</w:t>
       </w:r>
     </w:p>
-    <w:bookmarkEnd w:id="30"/>
-    <w:bookmarkStart w:id="31" w:name="probar-búsqueda-por-marca"/>
+    <w:bookmarkEnd w:id="32"/>
+    <w:bookmarkStart w:id="33" w:name="probar-búsqueda-por-marca"/>
     <w:p>
       <w:pPr>
         <w:pStyle w:val="Heading3"/>
@@ -1503,9 +1774,9 @@
         </w:pict>
       </w:r>
     </w:p>
-    <w:bookmarkEnd w:id="31"/>
-    <w:bookmarkEnd w:id="32"/>
-    <w:bookmarkStart w:id="33" w:name="estado-de-la-base-de-datos"/>
+    <w:bookmarkEnd w:id="33"/>
+    <w:bookmarkEnd w:id="34"/>
+    <w:bookmarkStart w:id="35" w:name="estado-de-la-base-de-datos"/>
     <w:p>
       <w:pPr>
         <w:pStyle w:val="Heading2"/>
@@ -1726,8 +1997,8 @@
         </w:pict>
       </w:r>
     </w:p>
-    <w:bookmarkEnd w:id="33"/>
-    <w:bookmarkStart w:id="34" w:name="validación-de-login-automático"/>
+    <w:bookmarkEnd w:id="35"/>
+    <w:bookmarkStart w:id="36" w:name="validación-de-login-automático"/>
     <w:p>
       <w:pPr>
         <w:pStyle w:val="Heading2"/>
@@ -1792,8 +2063,8 @@
         </w:pict>
       </w:r>
     </w:p>
-    <w:bookmarkEnd w:id="34"/>
-    <w:bookmarkStart w:id="35" w:name="archivos-clave-creadosmodificados"/>
+    <w:bookmarkEnd w:id="36"/>
+    <w:bookmarkStart w:id="37" w:name="archivos-clave-creadosmodificados"/>
     <w:p>
       <w:pPr>
         <w:pStyle w:val="Heading2"/>
@@ -2062,8 +2333,8 @@
         </w:pict>
       </w:r>
     </w:p>
-    <w:bookmarkEnd w:id="35"/>
-    <w:bookmarkStart w:id="36" w:name="X2a3406f11494a64f219ccde539ad04a4411a378"/>
+    <w:bookmarkEnd w:id="37"/>
+    <w:bookmarkStart w:id="38" w:name="X2a3406f11494a64f219ccde539ad04a4411a378"/>
     <w:p>
       <w:pPr>
         <w:pStyle w:val="Heading2"/>
@@ -2220,8 +2491,8 @@
         </w:pict>
       </w:r>
     </w:p>
-    <w:bookmarkEnd w:id="36"/>
-    <w:bookmarkStart w:id="39" w:name="marcas-chinas-compatibilidades-con-ia"/>
+    <w:bookmarkEnd w:id="38"/>
+    <w:bookmarkStart w:id="41" w:name="marcas-chinas-compatibilidades-con-ia"/>
     <w:p>
       <w:pPr>
         <w:pStyle w:val="Heading2"/>
@@ -2379,7 +2650,7 @@
         <w:t xml:space="preserve">** para que se distingan de las oficiales.</w:t>
       </w:r>
     </w:p>
-    <w:bookmarkStart w:id="37" w:name="cómo-activarla-en-tu-máquina-local"/>
+    <w:bookmarkStart w:id="39" w:name="cómo-activarla-en-tu-máquina-local"/>
     <w:p>
       <w:pPr>
         <w:pStyle w:val="Heading3"/>
@@ -2448,8 +2719,8 @@
         <w:t xml:space="preserve">¡Listo! A partir de ahí, cada vez que sincronices una pieza china sin fitment, la IA lo completa automáticamente.</w:t>
       </w:r>
     </w:p>
-    <w:bookmarkEnd w:id="37"/>
-    <w:bookmarkStart w:id="38" w:name="uso"/>
+    <w:bookmarkEnd w:id="39"/>
+    <w:bookmarkStart w:id="40" w:name="uso"/>
     <w:p>
       <w:pPr>
         <w:pStyle w:val="Heading3"/>
@@ -2639,9 +2910,9 @@
         </w:pict>
       </w:r>
     </w:p>
-    <w:bookmarkEnd w:id="38"/>
-    <w:bookmarkEnd w:id="39"/>
-    <w:bookmarkStart w:id="40" w:name="notas-importantes"/>
+    <w:bookmarkEnd w:id="40"/>
+    <w:bookmarkEnd w:id="41"/>
+    <w:bookmarkStart w:id="42" w:name="notas-importantes"/>
     <w:p>
       <w:pPr>
         <w:pStyle w:val="Heading2"/>
@@ -2856,8 +3127,8 @@
         <w:t xml:space="preserve">: https://github.com/fjcht/partsbot</w:t>
       </w:r>
     </w:p>
-    <w:bookmarkEnd w:id="40"/>
-    <w:bookmarkEnd w:id="41"/>
+    <w:bookmarkEnd w:id="42"/>
+    <w:bookmarkEnd w:id="43"/>
     <w:sectPr/>
   </w:body>
 </w:document>

</xml_diff>